<commit_message>
Update final report and dashboard screenshot
</commit_message>
<xml_diff>
--- a/report.docx
+++ b/report.docx
@@ -252,9 +252,8 @@
             <w:r>
               <w:rPr>
                 <w:sz w:val="17"/>
-                <w:highlight w:val="yellow"/>
               </w:rPr>
-              <w:t>link to your pipeline video, or file name if submitted separately</w:t>
+              <w:t>https://youtu.be/D74Bc9mUGh4</w:t>
             </w:r>
           </w:p>
         </w:tc>
@@ -1922,7 +1921,7 @@
         <w:rPr>
           <w:sz w:val="20"/>
         </w:rPr>
-        <w:t xml:space="preserve">: n_estimators=300, min_samples_leaf=3; </w:t>
+        <w:t xml:space="preserve">: min_samples_leaf=3, n_estimators=300; </w:t>
       </w:r>
       <w:r>
         <w:rPr>
@@ -3971,7 +3970,7 @@
       <w:r>
         <w:drawing>
           <wp:inline xmlns:a="http://schemas.openxmlformats.org/drawingml/2006/main" xmlns:pic="http://schemas.openxmlformats.org/drawingml/2006/picture">
-            <wp:extent cx="5220000" cy="2640189"/>
+            <wp:extent cx="5220000" cy="2626467"/>
             <wp:docPr id="21" name="Picture 21"/>
             <wp:cNvGraphicFramePr>
               <a:graphicFrameLocks noChangeAspect="1"/>
@@ -3992,7 +3991,7 @@
                   <pic:spPr>
                     <a:xfrm>
                       <a:off x="0" y="0"/>
-                      <a:ext cx="5220000" cy="2640189"/>
+                      <a:ext cx="5220000" cy="2626467"/>
                     </a:xfrm>
                     <a:prstGeom prst="rect"/>
                   </pic:spPr>

</xml_diff>